<commit_message>
feat: implement Collector Analytics Dashboard & refine department metrics
- Created CollectorAnalyticsPage with issue summary and department performance charts
- Added total_issues, resolved_count, and unresolved_count to analytics API (filtered by root issues)
- Refined department completion rate to rely on root issues' resolution_status
- Scoped pending/submitted/overdue department metrics to the latest minutes only
- Updated submit_response notification to use actual issue numbers and minutes titles
- Registered /collector/analytics route and added navigation link in CollectorHeader
</commit_message>
<xml_diff>
--- a/backend/media/minutes/mins-a.docx
+++ b/backend/media/minutes/mins-a.docx
@@ -3,6 +3,9 @@
 <w:document xmlns:wpc="http://schemas.microsoft.com/office/word/2010/wordprocessingCanvas" xmlns:cx="http://schemas.microsoft.com/office/drawing/2014/chartex" xmlns:cx1="http://schemas.microsoft.com/office/drawing/2015/9/8/chartex" xmlns:cx2="http://schemas.microsoft.com/office/drawing/2015/10/21/chartex" xmlns:cx3="http://schemas.microsoft.com/office/drawing/2016/5/9/chartex" xmlns:cx4="http://schemas.microsoft.com/office/drawing/2016/5/10/chartex" xmlns:cx5="http://schemas.microsoft.com/office/drawing/2016/5/11/chartex" xmlns:cx6="http://schemas.microsoft.com/office/drawing/2016/5/12/chartex" xmlns:cx7="http://schemas.microsoft.com/office/drawing/2016/5/13/chartex" xmlns:cx8="http://schemas.microsoft.com/office/drawing/2016/5/14/chartex" xmlns:mc="http://schemas.openxmlformats.org/markup-compatibility/2006" xmlns:aink="http://schemas.microsoft.com/office/drawing/2016/ink" xmlns:am3d="http://schemas.microsoft.com/office/drawing/2017/model3d" xmlns:o="urn:schemas-microsoft-com:office:office" xmlns:oel="http://schemas.microsoft.com/office/2019/extlst" xmlns:r="http://schemas.openxmlformats.org/officeDocument/2006/relationships" xmlns:m="http://schemas.openxmlformats.org/officeDocument/2006/math" xmlns:v="urn:schemas-microsoft-com:vml" xmlns:wp14="http://schemas.microsoft.com/office/word/2010/wordprocessingDrawing" xmlns:wp="http://schemas.openxmlformats.org/drawingml/2006/wordprocessingDrawing" xmlns:w10="urn:schemas-microsoft-com:office:word" xmlns:w="http://schemas.openxmlformats.org/wordprocessingml/2006/main" xmlns:w14="http://schemas.microsoft.com/office/word/2010/wordml" xmlns:w15="http://schemas.microsoft.com/office/word/2012/wordml" xmlns:w16cex="http://schemas.microsoft.com/office/word/2018/wordml/cex" xmlns:w16cid="http://schemas.microsoft.com/office/word/2016/wordml/cid" xmlns:w16="http://schemas.microsoft.com/office/word/2018/wordml" xmlns:w16du="http://schemas.microsoft.com/office/word/2023/wordml/word16du" xmlns:w16sdtdh="http://schemas.microsoft.com/office/word/2020/wordml/sdtdatahash" xmlns:w16sdtfl="http://schemas.microsoft.com/office/word/2024/wordml/sdtformatlock" xmlns:w16se="http://schemas.microsoft.com/office/word/2015/wordml/symex" xmlns:wpg="http://schemas.microsoft.com/office/word/2010/wordprocessingGroup" xmlns:wpi="http://schemas.microsoft.com/office/word/2010/wordprocessingInk" xmlns:wne="http://schemas.microsoft.com/office/word/2006/wordml" xmlns:wps="http://schemas.microsoft.com/office/word/2010/wordprocessingShape" mc:Ignorable="w14 w15 w16se w16cid w16 w16cex w16sdtdh w16sdtfl w16du wp14">
   <w:body>
     <w:p>
+      <w:pPr>
+        <w:jc w:val="both"/>
+      </w:pPr>
       <w:r>
         <w:t>26.04.2025-</w:t>
       </w:r>
@@ -158,6 +161,9 @@
       <w:proofErr w:type="spellEnd"/>
     </w:p>
     <w:p>
+      <w:pPr>
+        <w:jc w:val="both"/>
+      </w:pPr>
       <w:proofErr w:type="spellStart"/>
       <w:r>
         <w:rPr>
@@ -378,7 +384,6 @@
       <w:r>
         <w:t>.</w:t>
       </w:r>
-      <w:proofErr w:type="gramStart"/>
       <w:r>
         <w:rPr>
           <w:rFonts w:ascii="Nirmala UI" w:hAnsi="Nirmala UI" w:cs="Nirmala UI"/>
@@ -395,7 +400,6 @@
         <w:t>എസ്</w:t>
       </w:r>
       <w:proofErr w:type="spellEnd"/>
-      <w:proofErr w:type="gramEnd"/>
       <w:r>
         <w:br/>
       </w:r>
@@ -479,6 +483,9 @@
       </w:r>
     </w:p>
     <w:p>
+      <w:pPr>
+        <w:jc w:val="both"/>
+      </w:pPr>
       <w:proofErr w:type="spellStart"/>
       <w:r>
         <w:rPr>
@@ -500,7 +507,6 @@
       <w:r>
         <w:t>.</w:t>
       </w:r>
-      <w:proofErr w:type="gramStart"/>
       <w:r>
         <w:rPr>
           <w:rFonts w:ascii="Nirmala UI" w:hAnsi="Nirmala UI" w:cs="Nirmala UI"/>
@@ -517,7 +523,6 @@
         <w:t>എ</w:t>
       </w:r>
       <w:proofErr w:type="spellEnd"/>
-      <w:proofErr w:type="gramEnd"/>
       <w:r>
         <w:t xml:space="preserve"> </w:t>
       </w:r>
@@ -851,6 +856,9 @@
       </w:r>
     </w:p>
     <w:p>
+      <w:pPr>
+        <w:jc w:val="both"/>
+      </w:pPr>
       <w:proofErr w:type="spellStart"/>
       <w:r>
         <w:rPr>
@@ -1290,6 +1298,9 @@
       </w:r>
     </w:p>
     <w:p>
+      <w:pPr>
+        <w:jc w:val="both"/>
+      </w:pPr>
       <w:proofErr w:type="spellStart"/>
       <w:r>
         <w:rPr>
@@ -1565,6 +1576,9 @@
       </w:r>
     </w:p>
     <w:p>
+      <w:pPr>
+        <w:jc w:val="both"/>
+      </w:pPr>
       <w:proofErr w:type="spellStart"/>
       <w:r>
         <w:rPr>
@@ -1814,6 +1828,9 @@
       </w:r>
     </w:p>
     <w:p>
+      <w:pPr>
+        <w:jc w:val="both"/>
+      </w:pPr>
       <w:r>
         <w:rPr>
           <w:rFonts w:ascii="Nirmala UI" w:hAnsi="Nirmala UI" w:cs="Nirmala UI"/>
@@ -1844,7 +1861,6 @@
         <w:t xml:space="preserve"> </w:t>
       </w:r>
       <w:proofErr w:type="spellStart"/>
-      <w:proofErr w:type="gramStart"/>
       <w:r>
         <w:rPr>
           <w:rFonts w:ascii="Nirmala UI" w:hAnsi="Nirmala UI" w:cs="Nirmala UI" w:hint="cs"/>
@@ -1875,7 +1891,6 @@
         <w:t>അംഗൻവാടിക്ക്</w:t>
       </w:r>
       <w:proofErr w:type="spellEnd"/>
-      <w:proofErr w:type="gramEnd"/>
       <w:r>
         <w:br/>
       </w:r>
@@ -1970,7 +1985,6 @@
       <w:r>
         <w:t>.</w:t>
       </w:r>
-      <w:proofErr w:type="gramStart"/>
       <w:r>
         <w:rPr>
           <w:rFonts w:ascii="Nirmala UI" w:hAnsi="Nirmala UI" w:cs="Nirmala UI"/>
@@ -1987,7 +2001,6 @@
         <w:t>എസ്</w:t>
       </w:r>
       <w:proofErr w:type="spellEnd"/>
-      <w:proofErr w:type="gramEnd"/>
       <w:r>
         <w:t xml:space="preserve"> </w:t>
       </w:r>
@@ -2101,6 +2114,9 @@
       </w:r>
     </w:p>
     <w:p>
+      <w:pPr>
+        <w:jc w:val="right"/>
+      </w:pPr>
       <w:r>
         <w:t>(</w:t>
       </w:r>
@@ -2173,7 +2189,6 @@
       <w:r>
         <w:t>.</w:t>
       </w:r>
-      <w:proofErr w:type="gramStart"/>
       <w:r>
         <w:rPr>
           <w:rFonts w:ascii="Nirmala UI" w:hAnsi="Nirmala UI" w:cs="Nirmala UI"/>
@@ -2190,12 +2205,14 @@
         <w:t>എസ്</w:t>
       </w:r>
       <w:proofErr w:type="spellEnd"/>
-      <w:proofErr w:type="gramEnd"/>
       <w:r>
         <w:t>)</w:t>
       </w:r>
     </w:p>
     <w:p>
+      <w:pPr>
+        <w:jc w:val="both"/>
+      </w:pPr>
       <w:r>
         <w:rPr>
           <w:rFonts w:ascii="Nirmala UI" w:hAnsi="Nirmala UI" w:cs="Nirmala UI"/>
@@ -2435,7 +2452,6 @@
       <w:r>
         <w:t xml:space="preserve"> </w:t>
       </w:r>
-      <w:proofErr w:type="gramStart"/>
       <w:r>
         <w:rPr>
           <w:rFonts w:ascii="Nirmala UI" w:hAnsi="Nirmala UI" w:cs="Nirmala UI"/>
@@ -2452,11 +2468,9 @@
         </w:rPr>
         <w:t>എച്ച്</w:t>
       </w:r>
-      <w:proofErr w:type="gramEnd"/>
       <w:r>
         <w:t>.</w:t>
       </w:r>
-      <w:proofErr w:type="gramStart"/>
       <w:r>
         <w:rPr>
           <w:rFonts w:ascii="Nirmala UI" w:hAnsi="Nirmala UI" w:cs="Nirmala UI"/>
@@ -2473,7 +2487,6 @@
         <w:t>ഐ</w:t>
       </w:r>
       <w:proofErr w:type="spellEnd"/>
-      <w:proofErr w:type="gramEnd"/>
       <w:r>
         <w:t xml:space="preserve"> </w:t>
       </w:r>
@@ -2501,6 +2514,9 @@
       </w:r>
     </w:p>
     <w:p>
+      <w:pPr>
+        <w:jc w:val="right"/>
+      </w:pPr>
       <w:r>
         <w:t>(</w:t>
       </w:r>
@@ -2543,7 +2559,6 @@
       <w:r>
         <w:t xml:space="preserve">, </w:t>
       </w:r>
-      <w:proofErr w:type="gramStart"/>
       <w:r>
         <w:rPr>
           <w:rFonts w:ascii="Nirmala UI" w:hAnsi="Nirmala UI" w:cs="Nirmala UI"/>
@@ -2560,11 +2575,9 @@
         </w:rPr>
         <w:t>എച്ച്</w:t>
       </w:r>
-      <w:proofErr w:type="gramEnd"/>
       <w:r>
         <w:t>.</w:t>
       </w:r>
-      <w:proofErr w:type="gramStart"/>
       <w:r>
         <w:rPr>
           <w:rFonts w:ascii="Nirmala UI" w:hAnsi="Nirmala UI" w:cs="Nirmala UI"/>
@@ -2581,12 +2594,14 @@
         <w:t>ഐ</w:t>
       </w:r>
       <w:proofErr w:type="spellEnd"/>
-      <w:proofErr w:type="gramEnd"/>
       <w:r>
         <w:t>)</w:t>
       </w:r>
     </w:p>
     <w:p>
+      <w:pPr>
+        <w:jc w:val="both"/>
+      </w:pPr>
       <w:r>
         <w:t>3.</w:t>
       </w:r>
@@ -2813,6 +2828,9 @@
       </w:r>
     </w:p>
     <w:p>
+      <w:pPr>
+        <w:jc w:val="both"/>
+      </w:pPr>
       <w:proofErr w:type="spellStart"/>
       <w:r>
         <w:rPr>
@@ -3022,11 +3040,13 @@
       </w:r>
     </w:p>
     <w:p>
+      <w:pPr>
+        <w:jc w:val="right"/>
+      </w:pPr>
       <w:r>
         <w:t>(</w:t>
       </w:r>
       <w:proofErr w:type="spellStart"/>
-      <w:proofErr w:type="gramStart"/>
       <w:r>
         <w:rPr>
           <w:rFonts w:ascii="Nirmala UI" w:hAnsi="Nirmala UI" w:cs="Nirmala UI"/>
@@ -3035,11 +3055,7 @@
       </w:r>
       <w:proofErr w:type="spellEnd"/>
       <w:r>
-        <w:t xml:space="preserve"> :</w:t>
-      </w:r>
-      <w:proofErr w:type="gramEnd"/>
-      <w:r>
-        <w:t xml:space="preserve"> </w:t>
+        <w:t xml:space="preserve"> : </w:t>
       </w:r>
       <w:proofErr w:type="spellStart"/>
       <w:r>
@@ -3099,7 +3115,6 @@
       <w:r>
         <w:t>.</w:t>
       </w:r>
-      <w:proofErr w:type="gramStart"/>
       <w:r>
         <w:rPr>
           <w:rFonts w:ascii="Nirmala UI" w:hAnsi="Nirmala UI" w:cs="Nirmala UI"/>
@@ -3116,12 +3131,14 @@
         <w:t>എസ്</w:t>
       </w:r>
       <w:proofErr w:type="spellEnd"/>
-      <w:proofErr w:type="gramEnd"/>
       <w:r>
         <w:t>)</w:t>
       </w:r>
     </w:p>
     <w:p>
+      <w:pPr>
+        <w:jc w:val="both"/>
+      </w:pPr>
       <w:r>
         <w:rPr>
           <w:rFonts w:ascii="Nirmala UI" w:hAnsi="Nirmala UI" w:cs="Nirmala UI"/>
@@ -3235,6 +3252,9 @@
       </w:r>
     </w:p>
     <w:p>
+      <w:pPr>
+        <w:jc w:val="both"/>
+      </w:pPr>
       <w:r>
         <w:rPr>
           <w:rFonts w:ascii="Nirmala UI" w:hAnsi="Nirmala UI" w:cs="Nirmala UI"/>
@@ -3245,7 +3265,6 @@
         <w:t>.</w:t>
       </w:r>
       <w:proofErr w:type="spellStart"/>
-      <w:proofErr w:type="gramStart"/>
       <w:r>
         <w:rPr>
           <w:rFonts w:ascii="Nirmala UI" w:hAnsi="Nirmala UI" w:cs="Nirmala UI"/>
@@ -3262,7 +3281,6 @@
         <w:t>ഒ</w:t>
       </w:r>
       <w:proofErr w:type="spellEnd"/>
-      <w:proofErr w:type="gramEnd"/>
       <w:r>
         <w:t xml:space="preserve"> </w:t>
       </w:r>
@@ -3367,11 +3385,13 @@
       </w:r>
     </w:p>
     <w:p>
+      <w:pPr>
+        <w:jc w:val="right"/>
+      </w:pPr>
       <w:r>
         <w:t>(</w:t>
       </w:r>
       <w:proofErr w:type="spellStart"/>
-      <w:proofErr w:type="gramStart"/>
       <w:r>
         <w:rPr>
           <w:rFonts w:ascii="Nirmala UI" w:hAnsi="Nirmala UI" w:cs="Nirmala UI"/>
@@ -3380,11 +3400,7 @@
       </w:r>
       <w:proofErr w:type="spellEnd"/>
       <w:r>
-        <w:t xml:space="preserve"> :</w:t>
-      </w:r>
-      <w:proofErr w:type="gramEnd"/>
-      <w:r>
-        <w:t xml:space="preserve"> </w:t>
+        <w:t xml:space="preserve"> : </w:t>
       </w:r>
       <w:r>
         <w:rPr>
@@ -3396,7 +3412,6 @@
         <w:t>.</w:t>
       </w:r>
       <w:proofErr w:type="spellStart"/>
-      <w:proofErr w:type="gramStart"/>
       <w:r>
         <w:rPr>
           <w:rFonts w:ascii="Nirmala UI" w:hAnsi="Nirmala UI" w:cs="Nirmala UI"/>
@@ -3413,7 +3428,6 @@
         <w:t>ഒ</w:t>
       </w:r>
       <w:proofErr w:type="spellEnd"/>
-      <w:proofErr w:type="gramEnd"/>
       <w:r>
         <w:t xml:space="preserve">, </w:t>
       </w:r>
@@ -3436,6 +3450,9 @@
       </w:r>
     </w:p>
     <w:p>
+      <w:pPr>
+        <w:jc w:val="both"/>
+      </w:pPr>
       <w:r>
         <w:t>5.</w:t>
       </w:r>
@@ -3606,6 +3623,9 @@
       </w:r>
     </w:p>
     <w:p>
+      <w:pPr>
+        <w:jc w:val="both"/>
+      </w:pPr>
       <w:proofErr w:type="spellStart"/>
       <w:r>
         <w:rPr>
@@ -3730,11 +3750,13 @@
       </w:r>
     </w:p>
     <w:p>
+      <w:pPr>
+        <w:jc w:val="right"/>
+      </w:pPr>
       <w:r>
         <w:t>(</w:t>
       </w:r>
       <w:proofErr w:type="spellStart"/>
-      <w:proofErr w:type="gramStart"/>
       <w:r>
         <w:rPr>
           <w:rFonts w:ascii="Nirmala UI" w:hAnsi="Nirmala UI" w:cs="Nirmala UI"/>
@@ -3743,11 +3765,7 @@
       </w:r>
       <w:proofErr w:type="spellEnd"/>
       <w:r>
-        <w:t xml:space="preserve"> :</w:t>
-      </w:r>
-      <w:proofErr w:type="gramEnd"/>
-      <w:r>
-        <w:t xml:space="preserve"> </w:t>
+        <w:t xml:space="preserve"> : </w:t>
       </w:r>
       <w:proofErr w:type="spellStart"/>
       <w:r>
@@ -3800,18 +3818,16 @@
         <w:t>,</w:t>
       </w:r>
       <w:r>
-        <w:br/>
-      </w:r>
-      <w:proofErr w:type="spellStart"/>
+        <w:t xml:space="preserve">   </w:t>
+      </w:r>
       <w:r>
         <w:rPr>
           <w:rFonts w:ascii="Nirmala UI" w:hAnsi="Nirmala UI" w:cs="Nirmala UI"/>
         </w:rPr>
         <w:t>എക്സി</w:t>
       </w:r>
-      <w:proofErr w:type="spellEnd"/>
-      <w:r>
-        <w:t xml:space="preserve">. </w:t>
+      <w:r>
+        <w:t>.</w:t>
       </w:r>
       <w:proofErr w:type="spellStart"/>
       <w:r>
@@ -3828,27 +3844,302 @@
         <w:t>ർ</w:t>
       </w:r>
       <w:r>
-        <w:t xml:space="preserve">, KWA, </w:t>
-      </w:r>
-      <w:proofErr w:type="spellStart"/>
-      <w:r>
-        <w:rPr>
-          <w:rFonts w:ascii="Nirmala UI" w:hAnsi="Nirmala UI" w:cs="Nirmala UI"/>
-        </w:rPr>
-        <w:t>കണ്ണൂ</w:t>
-      </w:r>
-      <w:proofErr w:type="spellEnd"/>
-      <w:r>
-        <w:rPr>
-          <w:rFonts w:ascii="Nirmala UI" w:hAnsi="Nirmala UI" w:cs="Nirmala UI"/>
-        </w:rPr>
-        <w:t>ർ</w:t>
-      </w:r>
+        <w:rPr>
+          <w:rFonts w:ascii="Nirmala UI" w:hAnsi="Nirmala UI" w:cs="Nirmala UI"/>
+        </w:rPr>
+        <w:t>,</w:t>
+      </w:r>
+      <w:r>
+        <w:t xml:space="preserve">KWA </w:t>
+      </w:r>
+      <w:proofErr w:type="spellStart"/>
+      <w:r>
+        <w:rPr>
+          <w:rFonts w:ascii="Nirmala UI" w:hAnsi="Nirmala UI" w:cs="Nirmala UI"/>
+        </w:rPr>
+        <w:t>പ്രൊജക്റ്റ്</w:t>
+      </w:r>
+      <w:proofErr w:type="spellEnd"/>
+      <w:r>
+        <w:t xml:space="preserve"> </w:t>
+      </w:r>
+      <w:proofErr w:type="spellStart"/>
+      <w:r>
+        <w:rPr>
+          <w:rFonts w:ascii="Nirmala UI" w:hAnsi="Nirmala UI" w:cs="Nirmala UI"/>
+        </w:rPr>
+        <w:t>വിഭാഗം</w:t>
+      </w:r>
+      <w:proofErr w:type="spellEnd"/>
       <w:r>
         <w:t>)</w:t>
       </w:r>
     </w:p>
-    <w:p/>
+    <w:p>
+      <w:r>
+        <w:t xml:space="preserve">6. </w:t>
+      </w:r>
+      <w:proofErr w:type="spellStart"/>
+      <w:r>
+        <w:rPr>
+          <w:rFonts w:ascii="Nirmala UI" w:hAnsi="Nirmala UI" w:cs="Nirmala UI"/>
+        </w:rPr>
+        <w:t>ടെലിഫോ</w:t>
+      </w:r>
+      <w:proofErr w:type="spellEnd"/>
+      <w:r>
+        <w:rPr>
+          <w:rFonts w:ascii="Nirmala UI" w:hAnsi="Nirmala UI" w:cs="Nirmala UI"/>
+        </w:rPr>
+        <w:t>ൺ</w:t>
+      </w:r>
+      <w:r>
+        <w:t>/</w:t>
+      </w:r>
+      <w:proofErr w:type="spellStart"/>
+      <w:r>
+        <w:rPr>
+          <w:rFonts w:ascii="Nirmala UI" w:hAnsi="Nirmala UI" w:cs="Nirmala UI"/>
+        </w:rPr>
+        <w:t>ഇന്റർനെറ്റ്</w:t>
+      </w:r>
+      <w:proofErr w:type="spellEnd"/>
+      <w:r>
+        <w:t xml:space="preserve"> </w:t>
+      </w:r>
+      <w:proofErr w:type="spellStart"/>
+      <w:r>
+        <w:rPr>
+          <w:rFonts w:ascii="Nirmala UI" w:hAnsi="Nirmala UI" w:cs="Nirmala UI"/>
+        </w:rPr>
+        <w:t>കേബി</w:t>
+      </w:r>
+      <w:proofErr w:type="spellEnd"/>
+      <w:r>
+        <w:rPr>
+          <w:rFonts w:ascii="Nirmala UI" w:hAnsi="Nirmala UI" w:cs="Nirmala UI"/>
+        </w:rPr>
+        <w:t>ൾ</w:t>
+      </w:r>
+      <w:r>
+        <w:t xml:space="preserve"> </w:t>
+      </w:r>
+      <w:proofErr w:type="spellStart"/>
+      <w:r>
+        <w:rPr>
+          <w:rFonts w:ascii="Nirmala UI" w:hAnsi="Nirmala UI" w:cs="Nirmala UI"/>
+        </w:rPr>
+        <w:t>സ്ഥാപിക്കുന്നതിനായി</w:t>
+      </w:r>
+      <w:proofErr w:type="spellEnd"/>
+      <w:r>
+        <w:t xml:space="preserve"> </w:t>
+      </w:r>
+      <w:proofErr w:type="spellStart"/>
+      <w:r>
+        <w:rPr>
+          <w:rFonts w:ascii="Nirmala UI" w:hAnsi="Nirmala UI" w:cs="Nirmala UI"/>
+        </w:rPr>
+        <w:t>റോഡുക</w:t>
+      </w:r>
+      <w:proofErr w:type="spellEnd"/>
+      <w:r>
+        <w:rPr>
+          <w:rFonts w:ascii="Nirmala UI" w:hAnsi="Nirmala UI" w:cs="Nirmala UI"/>
+        </w:rPr>
+        <w:t>ൾ</w:t>
+      </w:r>
+      <w:r>
+        <w:t xml:space="preserve"> </w:t>
+      </w:r>
+      <w:proofErr w:type="spellStart"/>
+      <w:r>
+        <w:rPr>
+          <w:rFonts w:ascii="Nirmala UI" w:hAnsi="Nirmala UI" w:cs="Nirmala UI"/>
+        </w:rPr>
+        <w:t>കുഴിച്ചിട്ടതിനെ</w:t>
+      </w:r>
+      <w:proofErr w:type="spellEnd"/>
+      <w:r>
+        <w:t xml:space="preserve"> </w:t>
+      </w:r>
+      <w:proofErr w:type="spellStart"/>
+      <w:r>
+        <w:rPr>
+          <w:rFonts w:ascii="Nirmala UI" w:hAnsi="Nirmala UI" w:cs="Nirmala UI"/>
+        </w:rPr>
+        <w:t>തുടർന്ന്</w:t>
+      </w:r>
+      <w:proofErr w:type="spellEnd"/>
+      <w:r>
+        <w:t xml:space="preserve"> </w:t>
+      </w:r>
+      <w:proofErr w:type="spellStart"/>
+      <w:r>
+        <w:rPr>
+          <w:rFonts w:ascii="Nirmala UI" w:hAnsi="Nirmala UI" w:cs="Nirmala UI"/>
+        </w:rPr>
+        <w:t>ചില</w:t>
+      </w:r>
+      <w:proofErr w:type="spellEnd"/>
+      <w:r>
+        <w:t xml:space="preserve"> </w:t>
+      </w:r>
+      <w:proofErr w:type="spellStart"/>
+      <w:r>
+        <w:rPr>
+          <w:rFonts w:ascii="Nirmala UI" w:hAnsi="Nirmala UI" w:cs="Nirmala UI"/>
+        </w:rPr>
+        <w:t>ഭാഗങ്ങളി</w:t>
+      </w:r>
+      <w:proofErr w:type="spellEnd"/>
+      <w:r>
+        <w:rPr>
+          <w:rFonts w:ascii="Nirmala UI" w:hAnsi="Nirmala UI" w:cs="Nirmala UI"/>
+        </w:rPr>
+        <w:t>ൽ</w:t>
+      </w:r>
+      <w:r>
+        <w:t xml:space="preserve"> </w:t>
+      </w:r>
+      <w:proofErr w:type="spellStart"/>
+      <w:r>
+        <w:rPr>
+          <w:rFonts w:ascii="Nirmala UI" w:hAnsi="Nirmala UI" w:cs="Nirmala UI"/>
+        </w:rPr>
+        <w:t>റോഡുക</w:t>
+      </w:r>
+      <w:proofErr w:type="spellEnd"/>
+      <w:r>
+        <w:rPr>
+          <w:rFonts w:ascii="Nirmala UI" w:hAnsi="Nirmala UI" w:cs="Nirmala UI"/>
+        </w:rPr>
+        <w:t>ൾ</w:t>
+      </w:r>
+      <w:r>
+        <w:t xml:space="preserve"> </w:t>
+      </w:r>
+      <w:proofErr w:type="spellStart"/>
+      <w:r>
+        <w:rPr>
+          <w:rFonts w:ascii="Nirmala UI" w:hAnsi="Nirmala UI" w:cs="Nirmala UI"/>
+        </w:rPr>
+        <w:t>തകർന്ന</w:t>
+      </w:r>
+      <w:proofErr w:type="spellEnd"/>
+      <w:r>
+        <w:t xml:space="preserve"> </w:t>
+      </w:r>
+      <w:proofErr w:type="spellStart"/>
+      <w:r>
+        <w:rPr>
+          <w:rFonts w:ascii="Nirmala UI" w:hAnsi="Nirmala UI" w:cs="Nirmala UI"/>
+        </w:rPr>
+        <w:t>നിലയിലാണെന്ന</w:t>
+      </w:r>
+      <w:proofErr w:type="spellEnd"/>
+      <w:r>
+        <w:t xml:space="preserve"> </w:t>
+      </w:r>
+      <w:proofErr w:type="spellStart"/>
+      <w:r>
+        <w:rPr>
+          <w:rFonts w:ascii="Nirmala UI" w:hAnsi="Nirmala UI" w:cs="Nirmala UI"/>
+        </w:rPr>
+        <w:t>പരാതിക</w:t>
+      </w:r>
+      <w:proofErr w:type="spellEnd"/>
+      <w:r>
+        <w:rPr>
+          <w:rFonts w:ascii="Nirmala UI" w:hAnsi="Nirmala UI" w:cs="Nirmala UI"/>
+        </w:rPr>
+        <w:t>ൾ</w:t>
+      </w:r>
+      <w:r>
+        <w:t xml:space="preserve"> </w:t>
+      </w:r>
+      <w:proofErr w:type="spellStart"/>
+      <w:r>
+        <w:rPr>
+          <w:rFonts w:ascii="Nirmala UI" w:hAnsi="Nirmala UI" w:cs="Nirmala UI"/>
+        </w:rPr>
+        <w:t>ലഭിച്ചതായി</w:t>
+      </w:r>
+      <w:proofErr w:type="spellEnd"/>
+      <w:r>
+        <w:t xml:space="preserve"> </w:t>
+      </w:r>
+      <w:proofErr w:type="spellStart"/>
+      <w:r>
+        <w:rPr>
+          <w:rFonts w:ascii="Nirmala UI" w:hAnsi="Nirmala UI" w:cs="Nirmala UI"/>
+        </w:rPr>
+        <w:t>യോഗത്തി</w:t>
+      </w:r>
+      <w:proofErr w:type="spellEnd"/>
+      <w:r>
+        <w:rPr>
+          <w:rFonts w:ascii="Nirmala UI" w:hAnsi="Nirmala UI" w:cs="Nirmala UI"/>
+        </w:rPr>
+        <w:t>ൽ</w:t>
+      </w:r>
+      <w:r>
+        <w:t xml:space="preserve"> </w:t>
+      </w:r>
+      <w:proofErr w:type="spellStart"/>
+      <w:r>
+        <w:rPr>
+          <w:rFonts w:ascii="Nirmala UI" w:hAnsi="Nirmala UI" w:cs="Nirmala UI"/>
+        </w:rPr>
+        <w:t>ചർച്ചയായി</w:t>
+      </w:r>
+      <w:proofErr w:type="spellEnd"/>
+      <w:r>
+        <w:t>.</w:t>
+      </w:r>
+    </w:p>
+    <w:p>
+      <w:pPr>
+        <w:jc w:val="right"/>
+      </w:pPr>
+      <w:r>
+        <w:t>(</w:t>
+      </w:r>
+      <w:proofErr w:type="spellStart"/>
+      <w:r>
+        <w:rPr>
+          <w:rFonts w:ascii="Nirmala UI" w:hAnsi="Nirmala UI" w:cs="Nirmala UI"/>
+        </w:rPr>
+        <w:t>നടപടി</w:t>
+      </w:r>
+      <w:proofErr w:type="spellEnd"/>
+      <w:r>
+        <w:rPr>
+          <w:rFonts w:ascii="Nirmala UI" w:hAnsi="Nirmala UI" w:cs="Nirmala UI"/>
+        </w:rPr>
+        <w:t xml:space="preserve">: </w:t>
+      </w:r>
+      <w:proofErr w:type="spellStart"/>
+      <w:r>
+        <w:rPr>
+          <w:rFonts w:ascii="Nirmala UI" w:hAnsi="Nirmala UI" w:cs="Nirmala UI"/>
+        </w:rPr>
+        <w:t>ബി.എസ്.എൻ.എ</w:t>
+      </w:r>
+      <w:proofErr w:type="spellEnd"/>
+      <w:r>
+        <w:rPr>
+          <w:rFonts w:ascii="Nirmala UI" w:hAnsi="Nirmala UI" w:cs="Nirmala UI"/>
+        </w:rPr>
+        <w:t>ൽ.</w:t>
+      </w:r>
+      <w:r>
+        <w:rPr>
+          <w:rFonts w:ascii="Nirmala UI" w:hAnsi="Nirmala UI" w:cs="Nirmala UI"/>
+        </w:rPr>
+        <w:t>)</w:t>
+      </w:r>
+    </w:p>
     <w:sectPr>
       <w:pgSz w:w="11906" w:h="16838"/>
       <w:pgMar w:top="1440" w:right="1440" w:bottom="1440" w:left="1440" w:header="708" w:footer="708" w:gutter="0"/>

</xml_diff>